<commit_message>
Replace static TOC with auto Word TOC field; apply Heading 1/2/3 styles to all headings
Agent-Logs-Url: https://github.com/NikolaZhal/estimating_value_T/sessions/ac248903-6a0c-4439-b7b7-e66e123755c5

Co-authored-by: vacuum-xvx <101456513+vacuum-xvx@users.noreply.github.com>
</commit_message>
<xml_diff>
--- a/documentation.docx
+++ b/documentation.docx
@@ -411,733 +411,41 @@
     </w:p>
     <w:p>
       <w:pPr>
-        <w:spacing w:before="360" w:after="240" w:line="360" w:lineRule="auto"/>
-        <w:ind w:firstLine="0"/>
-        <w:jc w:val="center"/>
+        <w:pStyle w:val="Heading1"/>
       </w:pPr>
       <w:r>
-        <w:rPr>
-          <w:rFonts w:ascii="Times New Roman" w:hAnsi="Times New Roman"/>
-          <w:b/>
-          <w:i w:val="0"/>
-          <w:color w:val="000000"/>
-          <w:sz w:val="28"/>
-        </w:rPr>
         <w:t>СОДЕРЖАНИЕ</w:t>
       </w:r>
     </w:p>
     <w:p>
       <w:pPr>
-        <w:spacing w:line="360" w:lineRule="auto" w:before="0" w:after="0"/>
+        <w:spacing w:before="0" w:after="0"/>
+      </w:pPr>
+      <w:r>
+        <w:fldChar w:fldCharType="begin" w:dirty="true"/>
+      </w:r>
+      <w:r>
+        <w:instrText xml:space="preserve"> TOC \o "1-3" \h \z \u </w:instrText>
+      </w:r>
+      <w:r>
+        <w:fldChar w:fldCharType="end"/>
+      </w:r>
+    </w:p>
+    <w:p>
+      <w:pPr>
+        <w:spacing w:before="80" w:after="80" w:line="360" w:lineRule="auto"/>
         <w:ind w:firstLine="0"/>
-        <w:jc w:val="both"/>
+        <w:jc w:val="center"/>
       </w:pPr>
       <w:r>
         <w:rPr>
           <w:rFonts w:ascii="Times New Roman" w:hAnsi="Times New Roman"/>
           <w:b w:val="0"/>
+          <w:i/>
           <w:color w:val="000000"/>
-          <w:sz w:val="28"/>
+          <w:sz w:val="20"/>
         </w:rPr>
-        <w:t>ВВЕДЕНИЕ</w:t>
-      </w:r>
-      <w:r>
-        <w:rPr>
-          <w:rFonts w:ascii="Times New Roman" w:hAnsi="Times New Roman"/>
-          <w:b w:val="0"/>
-          <w:color w:val="000000"/>
-          <w:sz w:val="28"/>
-        </w:rPr>
-        <w:t xml:space="preserve"> ........................................................... </w:t>
-      </w:r>
-      <w:r>
-        <w:rPr>
-          <w:rFonts w:ascii="Times New Roman" w:hAnsi="Times New Roman"/>
-          <w:b w:val="0"/>
-          <w:color w:val="000000"/>
-          <w:sz w:val="28"/>
-        </w:rPr>
-        <w:t>4</w:t>
-      </w:r>
-    </w:p>
-    <w:p>
-      <w:pPr>
-        <w:spacing w:line="360" w:lineRule="auto" w:before="0" w:after="0"/>
-        <w:ind w:firstLine="0"/>
-        <w:jc w:val="both"/>
-      </w:pPr>
-      <w:r>
-        <w:rPr>
-          <w:rFonts w:ascii="Times New Roman" w:hAnsi="Times New Roman"/>
-          <w:b w:val="0"/>
-          <w:color w:val="000000"/>
-          <w:sz w:val="28"/>
-        </w:rPr>
-        <w:t>ЧАСТЬ I. ТЕОРЕТИЧЕСКАЯ ЧАСТЬ</w:t>
-      </w:r>
-      <w:r>
-        <w:rPr>
-          <w:rFonts w:ascii="Times New Roman" w:hAnsi="Times New Roman"/>
-          <w:b w:val="0"/>
-          <w:color w:val="000000"/>
-          <w:sz w:val="28"/>
-        </w:rPr>
-        <w:t xml:space="preserve"> ....................................... </w:t>
-      </w:r>
-      <w:r>
-        <w:rPr>
-          <w:rFonts w:ascii="Times New Roman" w:hAnsi="Times New Roman"/>
-          <w:b w:val="0"/>
-          <w:color w:val="000000"/>
-          <w:sz w:val="28"/>
-        </w:rPr>
-        <w:t>7</w:t>
-      </w:r>
-    </w:p>
-    <w:p>
-      <w:pPr>
-        <w:spacing w:line="360" w:lineRule="auto" w:before="0" w:after="0"/>
-        <w:ind w:firstLine="0"/>
-        <w:jc w:val="both"/>
-      </w:pPr>
-      <w:r>
-        <w:rPr>
-          <w:rFonts w:ascii="Times New Roman" w:hAnsi="Times New Roman"/>
-          <w:b w:val="0"/>
-          <w:color w:val="000000"/>
-          <w:sz w:val="28"/>
-        </w:rPr>
-        <w:t xml:space="preserve">  1.1. Машинное обучение: основные понятия и задачи</w:t>
-      </w:r>
-      <w:r>
-        <w:rPr>
-          <w:rFonts w:ascii="Times New Roman" w:hAnsi="Times New Roman"/>
-          <w:b w:val="0"/>
-          <w:color w:val="000000"/>
-          <w:sz w:val="28"/>
-        </w:rPr>
-        <w:t xml:space="preserve"> ................ </w:t>
-      </w:r>
-      <w:r>
-        <w:rPr>
-          <w:rFonts w:ascii="Times New Roman" w:hAnsi="Times New Roman"/>
-          <w:b w:val="0"/>
-          <w:color w:val="000000"/>
-          <w:sz w:val="28"/>
-        </w:rPr>
-        <w:t>7</w:t>
-      </w:r>
-    </w:p>
-    <w:p>
-      <w:pPr>
-        <w:spacing w:line="360" w:lineRule="auto" w:before="0" w:after="0"/>
-        <w:ind w:firstLine="0"/>
-        <w:jc w:val="both"/>
-      </w:pPr>
-      <w:r>
-        <w:rPr>
-          <w:rFonts w:ascii="Times New Roman" w:hAnsi="Times New Roman"/>
-          <w:b w:val="0"/>
-          <w:color w:val="000000"/>
-          <w:sz w:val="28"/>
-        </w:rPr>
-        <w:t xml:space="preserve">  1.2. Нейронные сети</w:t>
-      </w:r>
-      <w:r>
-        <w:rPr>
-          <w:rFonts w:ascii="Times New Roman" w:hAnsi="Times New Roman"/>
-          <w:b w:val="0"/>
-          <w:color w:val="000000"/>
-          <w:sz w:val="28"/>
-        </w:rPr>
-        <w:t xml:space="preserve"> .............................................. </w:t>
-      </w:r>
-      <w:r>
-        <w:rPr>
-          <w:rFonts w:ascii="Times New Roman" w:hAnsi="Times New Roman"/>
-          <w:b w:val="0"/>
-          <w:color w:val="000000"/>
-          <w:sz w:val="28"/>
-        </w:rPr>
-        <w:t>9</w:t>
-      </w:r>
-    </w:p>
-    <w:p>
-      <w:pPr>
-        <w:spacing w:line="360" w:lineRule="auto" w:before="0" w:after="0"/>
-        <w:ind w:firstLine="0"/>
-        <w:jc w:val="both"/>
-      </w:pPr>
-      <w:r>
-        <w:rPr>
-          <w:rFonts w:ascii="Times New Roman" w:hAnsi="Times New Roman"/>
-          <w:b w:val="0"/>
-          <w:color w:val="000000"/>
-          <w:sz w:val="28"/>
-        </w:rPr>
-        <w:t xml:space="preserve">  1.3. Обучение с учителем и без учителя</w:t>
-      </w:r>
-      <w:r>
-        <w:rPr>
-          <w:rFonts w:ascii="Times New Roman" w:hAnsi="Times New Roman"/>
-          <w:b w:val="0"/>
-          <w:color w:val="000000"/>
-          <w:sz w:val="28"/>
-        </w:rPr>
-        <w:t xml:space="preserve"> .......................... </w:t>
-      </w:r>
-      <w:r>
-        <w:rPr>
-          <w:rFonts w:ascii="Times New Roman" w:hAnsi="Times New Roman"/>
-          <w:b w:val="0"/>
-          <w:color w:val="000000"/>
-          <w:sz w:val="28"/>
-        </w:rPr>
-        <w:t>12</w:t>
-      </w:r>
-    </w:p>
-    <w:p>
-      <w:pPr>
-        <w:spacing w:line="360" w:lineRule="auto" w:before="0" w:after="0"/>
-        <w:ind w:firstLine="0"/>
-        <w:jc w:val="both"/>
-      </w:pPr>
-      <w:r>
-        <w:rPr>
-          <w:rFonts w:ascii="Times New Roman" w:hAnsi="Times New Roman"/>
-          <w:b w:val="0"/>
-          <w:color w:val="000000"/>
-          <w:sz w:val="28"/>
-        </w:rPr>
-        <w:t xml:space="preserve">  1.4. Деревья решений и ансамблевые методы</w:t>
-      </w:r>
-      <w:r>
-        <w:rPr>
-          <w:rFonts w:ascii="Times New Roman" w:hAnsi="Times New Roman"/>
-          <w:b w:val="0"/>
-          <w:color w:val="000000"/>
-          <w:sz w:val="28"/>
-        </w:rPr>
-        <w:t xml:space="preserve"> ....................... </w:t>
-      </w:r>
-      <w:r>
-        <w:rPr>
-          <w:rFonts w:ascii="Times New Roman" w:hAnsi="Times New Roman"/>
-          <w:b w:val="0"/>
-          <w:color w:val="000000"/>
-          <w:sz w:val="28"/>
-        </w:rPr>
-        <w:t>15</w:t>
-      </w:r>
-    </w:p>
-    <w:p>
-      <w:pPr>
-        <w:spacing w:line="360" w:lineRule="auto" w:before="0" w:after="0"/>
-        <w:ind w:firstLine="0"/>
-        <w:jc w:val="both"/>
-      </w:pPr>
-      <w:r>
-        <w:rPr>
-          <w:rFonts w:ascii="Times New Roman" w:hAnsi="Times New Roman"/>
-          <w:b w:val="0"/>
-          <w:color w:val="000000"/>
-          <w:sz w:val="28"/>
-        </w:rPr>
-        <w:t xml:space="preserve">  1.5. Градиентный бустинг</w:t>
-      </w:r>
-      <w:r>
-        <w:rPr>
-          <w:rFonts w:ascii="Times New Roman" w:hAnsi="Times New Roman"/>
-          <w:b w:val="0"/>
-          <w:color w:val="000000"/>
-          <w:sz w:val="28"/>
-        </w:rPr>
-        <w:t xml:space="preserve"> ........................................ </w:t>
-      </w:r>
-      <w:r>
-        <w:rPr>
-          <w:rFonts w:ascii="Times New Roman" w:hAnsi="Times New Roman"/>
-          <w:b w:val="0"/>
-          <w:color w:val="000000"/>
-          <w:sz w:val="28"/>
-        </w:rPr>
-        <w:t>17</w:t>
-      </w:r>
-    </w:p>
-    <w:p>
-      <w:pPr>
-        <w:spacing w:line="360" w:lineRule="auto" w:before="0" w:after="0"/>
-        <w:ind w:firstLine="0"/>
-        <w:jc w:val="both"/>
-      </w:pPr>
-      <w:r>
-        <w:rPr>
-          <w:rFonts w:ascii="Times New Roman" w:hAnsi="Times New Roman"/>
-          <w:b w:val="0"/>
-          <w:color w:val="000000"/>
-          <w:sz w:val="28"/>
-        </w:rPr>
-        <w:t>ЧАСТЬ II. ПРАКТИЧЕСКАЯ ЧАСТЬ</w:t>
-      </w:r>
-      <w:r>
-        <w:rPr>
-          <w:rFonts w:ascii="Times New Roman" w:hAnsi="Times New Roman"/>
-          <w:b w:val="0"/>
-          <w:color w:val="000000"/>
-          <w:sz w:val="28"/>
-        </w:rPr>
-        <w:t xml:space="preserve"> ...................................... </w:t>
-      </w:r>
-      <w:r>
-        <w:rPr>
-          <w:rFonts w:ascii="Times New Roman" w:hAnsi="Times New Roman"/>
-          <w:b w:val="0"/>
-          <w:color w:val="000000"/>
-          <w:sz w:val="28"/>
-        </w:rPr>
-        <w:t>20</w:t>
-      </w:r>
-    </w:p>
-    <w:p>
-      <w:pPr>
-        <w:spacing w:line="360" w:lineRule="auto" w:before="0" w:after="0"/>
-        <w:ind w:firstLine="0"/>
-        <w:jc w:val="both"/>
-      </w:pPr>
-      <w:r>
-        <w:rPr>
-          <w:rFonts w:ascii="Times New Roman" w:hAnsi="Times New Roman"/>
-          <w:b w:val="0"/>
-          <w:color w:val="000000"/>
-          <w:sz w:val="28"/>
-        </w:rPr>
-        <w:t xml:space="preserve">  2.1. Технологический стек</w:t>
-      </w:r>
-      <w:r>
-        <w:rPr>
-          <w:rFonts w:ascii="Times New Roman" w:hAnsi="Times New Roman"/>
-          <w:b w:val="0"/>
-          <w:color w:val="000000"/>
-          <w:sz w:val="28"/>
-        </w:rPr>
-        <w:t xml:space="preserve"> ....................................... </w:t>
-      </w:r>
-      <w:r>
-        <w:rPr>
-          <w:rFonts w:ascii="Times New Roman" w:hAnsi="Times New Roman"/>
-          <w:b w:val="0"/>
-          <w:color w:val="000000"/>
-          <w:sz w:val="28"/>
-        </w:rPr>
-        <w:t>20</w:t>
-      </w:r>
-    </w:p>
-    <w:p>
-      <w:pPr>
-        <w:spacing w:line="360" w:lineRule="auto" w:before="0" w:after="0"/>
-        <w:ind w:firstLine="0"/>
-        <w:jc w:val="both"/>
-      </w:pPr>
-      <w:r>
-        <w:rPr>
-          <w:rFonts w:ascii="Times New Roman" w:hAnsi="Times New Roman"/>
-          <w:b w:val="0"/>
-          <w:color w:val="000000"/>
-          <w:sz w:val="28"/>
-        </w:rPr>
-        <w:t xml:space="preserve">  2.2. Используемые библиотеки и модули</w:t>
-      </w:r>
-      <w:r>
-        <w:rPr>
-          <w:rFonts w:ascii="Times New Roman" w:hAnsi="Times New Roman"/>
-          <w:b w:val="0"/>
-          <w:color w:val="000000"/>
-          <w:sz w:val="28"/>
-        </w:rPr>
-        <w:t xml:space="preserve"> ........................... </w:t>
-      </w:r>
-      <w:r>
-        <w:rPr>
-          <w:rFonts w:ascii="Times New Roman" w:hAnsi="Times New Roman"/>
-          <w:b w:val="0"/>
-          <w:color w:val="000000"/>
-          <w:sz w:val="28"/>
-        </w:rPr>
-        <w:t>22</w:t>
-      </w:r>
-    </w:p>
-    <w:p>
-      <w:pPr>
-        <w:spacing w:line="360" w:lineRule="auto" w:before="0" w:after="0"/>
-        <w:ind w:firstLine="0"/>
-        <w:jc w:val="both"/>
-      </w:pPr>
-      <w:r>
-        <w:rPr>
-          <w:rFonts w:ascii="Times New Roman" w:hAnsi="Times New Roman"/>
-          <w:b w:val="0"/>
-          <w:color w:val="000000"/>
-          <w:sz w:val="28"/>
-        </w:rPr>
-        <w:t xml:space="preserve">  2.3. Описание набора данных</w:t>
-      </w:r>
-      <w:r>
-        <w:rPr>
-          <w:rFonts w:ascii="Times New Roman" w:hAnsi="Times New Roman"/>
-          <w:b w:val="0"/>
-          <w:color w:val="000000"/>
-          <w:sz w:val="28"/>
-        </w:rPr>
-        <w:t xml:space="preserve"> ..................................... </w:t>
-      </w:r>
-      <w:r>
-        <w:rPr>
-          <w:rFonts w:ascii="Times New Roman" w:hAnsi="Times New Roman"/>
-          <w:b w:val="0"/>
-          <w:color w:val="000000"/>
-          <w:sz w:val="28"/>
-        </w:rPr>
-        <w:t>25</w:t>
-      </w:r>
-    </w:p>
-    <w:p>
-      <w:pPr>
-        <w:spacing w:line="360" w:lineRule="auto" w:before="0" w:after="0"/>
-        <w:ind w:firstLine="0"/>
-        <w:jc w:val="both"/>
-      </w:pPr>
-      <w:r>
-        <w:rPr>
-          <w:rFonts w:ascii="Times New Roman" w:hAnsi="Times New Roman"/>
-          <w:b w:val="0"/>
-          <w:color w:val="000000"/>
-          <w:sz w:val="28"/>
-        </w:rPr>
-        <w:t xml:space="preserve">  2.4. Разведочный анализ данных (EDA)</w:t>
-      </w:r>
-      <w:r>
-        <w:rPr>
-          <w:rFonts w:ascii="Times New Roman" w:hAnsi="Times New Roman"/>
-          <w:b w:val="0"/>
-          <w:color w:val="000000"/>
-          <w:sz w:val="28"/>
-        </w:rPr>
-        <w:t xml:space="preserve"> ............................ </w:t>
-      </w:r>
-      <w:r>
-        <w:rPr>
-          <w:rFonts w:ascii="Times New Roman" w:hAnsi="Times New Roman"/>
-          <w:b w:val="0"/>
-          <w:color w:val="000000"/>
-          <w:sz w:val="28"/>
-        </w:rPr>
-        <w:t>27</w:t>
-      </w:r>
-    </w:p>
-    <w:p>
-      <w:pPr>
-        <w:spacing w:line="360" w:lineRule="auto" w:before="0" w:after="0"/>
-        <w:ind w:firstLine="0"/>
-        <w:jc w:val="both"/>
-      </w:pPr>
-      <w:r>
-        <w:rPr>
-          <w:rFonts w:ascii="Times New Roman" w:hAnsi="Times New Roman"/>
-          <w:b w:val="0"/>
-          <w:color w:val="000000"/>
-          <w:sz w:val="28"/>
-        </w:rPr>
-        <w:t xml:space="preserve">  2.5. Предобработка данных и нормировка</w:t>
-      </w:r>
-      <w:r>
-        <w:rPr>
-          <w:rFonts w:ascii="Times New Roman" w:hAnsi="Times New Roman"/>
-          <w:b w:val="0"/>
-          <w:color w:val="000000"/>
-          <w:sz w:val="28"/>
-        </w:rPr>
-        <w:t xml:space="preserve"> .......................... </w:t>
-      </w:r>
-      <w:r>
-        <w:rPr>
-          <w:rFonts w:ascii="Times New Roman" w:hAnsi="Times New Roman"/>
-          <w:b w:val="0"/>
-          <w:color w:val="000000"/>
-          <w:sz w:val="28"/>
-        </w:rPr>
-        <w:t>29</w:t>
-      </w:r>
-    </w:p>
-    <w:p>
-      <w:pPr>
-        <w:spacing w:line="360" w:lineRule="auto" w:before="0" w:after="0"/>
-        <w:ind w:firstLine="0"/>
-        <w:jc w:val="both"/>
-      </w:pPr>
-      <w:r>
-        <w:rPr>
-          <w:rFonts w:ascii="Times New Roman" w:hAnsi="Times New Roman"/>
-          <w:b w:val="0"/>
-          <w:color w:val="000000"/>
-          <w:sz w:val="28"/>
-        </w:rPr>
-        <w:t xml:space="preserve">  2.6. Архитектура модели</w:t>
-      </w:r>
-      <w:r>
-        <w:rPr>
-          <w:rFonts w:ascii="Times New Roman" w:hAnsi="Times New Roman"/>
-          <w:b w:val="0"/>
-          <w:color w:val="000000"/>
-          <w:sz w:val="28"/>
-        </w:rPr>
-        <w:t xml:space="preserve"> ......................................... </w:t>
-      </w:r>
-      <w:r>
-        <w:rPr>
-          <w:rFonts w:ascii="Times New Roman" w:hAnsi="Times New Roman"/>
-          <w:b w:val="0"/>
-          <w:color w:val="000000"/>
-          <w:sz w:val="28"/>
-        </w:rPr>
-        <w:t>32</w:t>
-      </w:r>
-    </w:p>
-    <w:p>
-      <w:pPr>
-        <w:spacing w:line="360" w:lineRule="auto" w:before="0" w:after="0"/>
-        <w:ind w:firstLine="0"/>
-        <w:jc w:val="both"/>
-      </w:pPr>
-      <w:r>
-        <w:rPr>
-          <w:rFonts w:ascii="Times New Roman" w:hAnsi="Times New Roman"/>
-          <w:b w:val="0"/>
-          <w:color w:val="000000"/>
-          <w:sz w:val="28"/>
-        </w:rPr>
-        <w:t xml:space="preserve">  2.7. Обучение, кросс-валидация и оценка качества</w:t>
-      </w:r>
-      <w:r>
-        <w:rPr>
-          <w:rFonts w:ascii="Times New Roman" w:hAnsi="Times New Roman"/>
-          <w:b w:val="0"/>
-          <w:color w:val="000000"/>
-          <w:sz w:val="28"/>
-        </w:rPr>
-        <w:t xml:space="preserve"> ................ </w:t>
-      </w:r>
-      <w:r>
-        <w:rPr>
-          <w:rFonts w:ascii="Times New Roman" w:hAnsi="Times New Roman"/>
-          <w:b w:val="0"/>
-          <w:color w:val="000000"/>
-          <w:sz w:val="28"/>
-        </w:rPr>
-        <w:t>34</w:t>
-      </w:r>
-    </w:p>
-    <w:p>
-      <w:pPr>
-        <w:spacing w:line="360" w:lineRule="auto" w:before="0" w:after="0"/>
-        <w:ind w:firstLine="0"/>
-        <w:jc w:val="both"/>
-      </w:pPr>
-      <w:r>
-        <w:rPr>
-          <w:rFonts w:ascii="Times New Roman" w:hAnsi="Times New Roman"/>
-          <w:b w:val="0"/>
-          <w:color w:val="000000"/>
-          <w:sz w:val="28"/>
-        </w:rPr>
-        <w:t xml:space="preserve">  2.8. Веб-приложение (Streamlit)</w:t>
-      </w:r>
-      <w:r>
-        <w:rPr>
-          <w:rFonts w:ascii="Times New Roman" w:hAnsi="Times New Roman"/>
-          <w:b w:val="0"/>
-          <w:color w:val="000000"/>
-          <w:sz w:val="28"/>
-        </w:rPr>
-        <w:t xml:space="preserve"> ................................. </w:t>
-      </w:r>
-      <w:r>
-        <w:rPr>
-          <w:rFonts w:ascii="Times New Roman" w:hAnsi="Times New Roman"/>
-          <w:b w:val="0"/>
-          <w:color w:val="000000"/>
-          <w:sz w:val="28"/>
-        </w:rPr>
-        <w:t>37</w:t>
-      </w:r>
-    </w:p>
-    <w:p>
-      <w:pPr>
-        <w:spacing w:line="360" w:lineRule="auto" w:before="0" w:after="0"/>
-        <w:ind w:firstLine="0"/>
-        <w:jc w:val="both"/>
-      </w:pPr>
-      <w:r>
-        <w:rPr>
-          <w:rFonts w:ascii="Times New Roman" w:hAnsi="Times New Roman"/>
-          <w:b w:val="0"/>
-          <w:color w:val="000000"/>
-          <w:sz w:val="28"/>
-        </w:rPr>
-        <w:t>ЧАСТЬ III. ДОКУМЕНТАЦИОННАЯ ЧАСТЬ</w:t>
-      </w:r>
-      <w:r>
-        <w:rPr>
-          <w:rFonts w:ascii="Times New Roman" w:hAnsi="Times New Roman"/>
-          <w:b w:val="0"/>
-          <w:color w:val="000000"/>
-          <w:sz w:val="28"/>
-        </w:rPr>
-        <w:t xml:space="preserve"> ................................. </w:t>
-      </w:r>
-      <w:r>
-        <w:rPr>
-          <w:rFonts w:ascii="Times New Roman" w:hAnsi="Times New Roman"/>
-          <w:b w:val="0"/>
-          <w:color w:val="000000"/>
-          <w:sz w:val="28"/>
-        </w:rPr>
-        <w:t>39</w:t>
-      </w:r>
-    </w:p>
-    <w:p>
-      <w:pPr>
-        <w:spacing w:line="360" w:lineRule="auto" w:before="0" w:after="0"/>
-        <w:ind w:firstLine="0"/>
-        <w:jc w:val="both"/>
-      </w:pPr>
-      <w:r>
-        <w:rPr>
-          <w:rFonts w:ascii="Times New Roman" w:hAnsi="Times New Roman"/>
-          <w:b w:val="0"/>
-          <w:color w:val="000000"/>
-          <w:sz w:val="28"/>
-        </w:rPr>
-        <w:t xml:space="preserve">  3.1. Сравнение форматов сохранения модели: joblib и ONNX</w:t>
-      </w:r>
-      <w:r>
-        <w:rPr>
-          <w:rFonts w:ascii="Times New Roman" w:hAnsi="Times New Roman"/>
-          <w:b w:val="0"/>
-          <w:color w:val="000000"/>
-          <w:sz w:val="28"/>
-        </w:rPr>
-        <w:t xml:space="preserve"> ........ </w:t>
-      </w:r>
-      <w:r>
-        <w:rPr>
-          <w:rFonts w:ascii="Times New Roman" w:hAnsi="Times New Roman"/>
-          <w:b w:val="0"/>
-          <w:color w:val="000000"/>
-          <w:sz w:val="28"/>
-        </w:rPr>
-        <w:t>39</w:t>
-      </w:r>
-    </w:p>
-    <w:p>
-      <w:pPr>
-        <w:spacing w:line="360" w:lineRule="auto" w:before="0" w:after="0"/>
-        <w:ind w:firstLine="0"/>
-        <w:jc w:val="both"/>
-      </w:pPr>
-      <w:r>
-        <w:rPr>
-          <w:rFonts w:ascii="Times New Roman" w:hAnsi="Times New Roman"/>
-          <w:b w:val="0"/>
-          <w:color w:val="000000"/>
-          <w:sz w:val="28"/>
-        </w:rPr>
-        <w:t xml:space="preserve">  3.2. Руководство пользователя</w:t>
-      </w:r>
-      <w:r>
-        <w:rPr>
-          <w:rFonts w:ascii="Times New Roman" w:hAnsi="Times New Roman"/>
-          <w:b w:val="0"/>
-          <w:color w:val="000000"/>
-          <w:sz w:val="28"/>
-        </w:rPr>
-        <w:t xml:space="preserve"> ................................... </w:t>
-      </w:r>
-      <w:r>
-        <w:rPr>
-          <w:rFonts w:ascii="Times New Roman" w:hAnsi="Times New Roman"/>
-          <w:b w:val="0"/>
-          <w:color w:val="000000"/>
-          <w:sz w:val="28"/>
-        </w:rPr>
-        <w:t>43</w:t>
-      </w:r>
-    </w:p>
-    <w:p>
-      <w:pPr>
-        <w:spacing w:line="360" w:lineRule="auto" w:before="0" w:after="0"/>
-        <w:ind w:firstLine="0"/>
-        <w:jc w:val="both"/>
-      </w:pPr>
-      <w:r>
-        <w:rPr>
-          <w:rFonts w:ascii="Times New Roman" w:hAnsi="Times New Roman"/>
-          <w:b w:val="0"/>
-          <w:color w:val="000000"/>
-          <w:sz w:val="28"/>
-        </w:rPr>
-        <w:t>ЗАКЛЮЧЕНИЕ</w:t>
-      </w:r>
-      <w:r>
-        <w:rPr>
-          <w:rFonts w:ascii="Times New Roman" w:hAnsi="Times New Roman"/>
-          <w:b w:val="0"/>
-          <w:color w:val="000000"/>
-          <w:sz w:val="28"/>
-        </w:rPr>
-        <w:t xml:space="preserve"> ........................................................ </w:t>
-      </w:r>
-      <w:r>
-        <w:rPr>
-          <w:rFonts w:ascii="Times New Roman" w:hAnsi="Times New Roman"/>
-          <w:b w:val="0"/>
-          <w:color w:val="000000"/>
-          <w:sz w:val="28"/>
-        </w:rPr>
-        <w:t>47</w:t>
-      </w:r>
-    </w:p>
-    <w:p>
-      <w:pPr>
-        <w:spacing w:line="360" w:lineRule="auto" w:before="0" w:after="0"/>
-        <w:ind w:firstLine="0"/>
-        <w:jc w:val="both"/>
-      </w:pPr>
-      <w:r>
-        <w:rPr>
-          <w:rFonts w:ascii="Times New Roman" w:hAnsi="Times New Roman"/>
-          <w:b w:val="0"/>
-          <w:color w:val="000000"/>
-          <w:sz w:val="28"/>
-        </w:rPr>
-        <w:t>СПИСОК ИСПОЛЬЗОВАННЫХ ИСТОЧНИКОВ</w:t>
-      </w:r>
-      <w:r>
-        <w:rPr>
-          <w:rFonts w:ascii="Times New Roman" w:hAnsi="Times New Roman"/>
-          <w:b w:val="0"/>
-          <w:color w:val="000000"/>
-          <w:sz w:val="28"/>
-        </w:rPr>
-        <w:t xml:space="preserve"> .................................. </w:t>
-      </w:r>
-      <w:r>
-        <w:rPr>
-          <w:rFonts w:ascii="Times New Roman" w:hAnsi="Times New Roman"/>
-          <w:b w:val="0"/>
-          <w:color w:val="000000"/>
-          <w:sz w:val="28"/>
-        </w:rPr>
-        <w:t>49</w:t>
+        <w:t>[Откройте в MS Word → нажмите Ctrl+A → F9 → «Обновить всё поле» для генерации номеров страниц]</w:t>
       </w:r>
     </w:p>
     <w:p>
@@ -1147,18 +455,9 @@
     </w:p>
     <w:p>
       <w:pPr>
-        <w:spacing w:before="360" w:after="240" w:line="360" w:lineRule="auto"/>
-        <w:ind w:firstLine="0"/>
-        <w:jc w:val="center"/>
+        <w:pStyle w:val="Heading1"/>
       </w:pPr>
       <w:r>
-        <w:rPr>
-          <w:rFonts w:ascii="Times New Roman" w:hAnsi="Times New Roman"/>
-          <w:b/>
-          <w:i w:val="0"/>
-          <w:color w:val="000000"/>
-          <w:sz w:val="28"/>
-        </w:rPr>
         <w:t>ВВЕДЕНИЕ</w:t>
       </w:r>
     </w:p>
@@ -1215,18 +514,9 @@
     </w:p>
     <w:p>
       <w:pPr>
-        <w:spacing w:before="240" w:after="120" w:line="360" w:lineRule="auto"/>
-        <w:ind w:firstLine="709"/>
-        <w:jc w:val="both"/>
+        <w:pStyle w:val="Heading2"/>
       </w:pPr>
       <w:r>
-        <w:rPr>
-          <w:rFonts w:ascii="Times New Roman" w:hAnsi="Times New Roman"/>
-          <w:b/>
-          <w:i w:val="0"/>
-          <w:color w:val="000000"/>
-          <w:sz w:val="28"/>
-        </w:rPr>
         <w:t>Актуальность работы</w:t>
       </w:r>
     </w:p>
@@ -1266,18 +556,9 @@
     </w:p>
     <w:p>
       <w:pPr>
-        <w:spacing w:before="240" w:after="120" w:line="360" w:lineRule="auto"/>
-        <w:ind w:firstLine="709"/>
-        <w:jc w:val="both"/>
+        <w:pStyle w:val="Heading2"/>
       </w:pPr>
       <w:r>
-        <w:rPr>
-          <w:rFonts w:ascii="Times New Roman" w:hAnsi="Times New Roman"/>
-          <w:b/>
-          <w:i w:val="0"/>
-          <w:color w:val="000000"/>
-          <w:sz w:val="28"/>
-        </w:rPr>
         <w:t>Цель и задачи работы</w:t>
       </w:r>
     </w:p>
@@ -1470,18 +751,9 @@
     </w:p>
     <w:p>
       <w:pPr>
-        <w:spacing w:before="240" w:after="120" w:line="360" w:lineRule="auto"/>
-        <w:ind w:firstLine="709"/>
-        <w:jc w:val="both"/>
+        <w:pStyle w:val="Heading2"/>
       </w:pPr>
       <w:r>
-        <w:rPr>
-          <w:rFonts w:ascii="Times New Roman" w:hAnsi="Times New Roman"/>
-          <w:b/>
-          <w:i w:val="0"/>
-          <w:color w:val="000000"/>
-          <w:sz w:val="28"/>
-        </w:rPr>
         <w:t>Объект и предмет исследования</w:t>
       </w:r>
     </w:p>
@@ -1504,18 +776,9 @@
     </w:p>
     <w:p>
       <w:pPr>
-        <w:spacing w:before="240" w:after="120" w:line="360" w:lineRule="auto"/>
-        <w:ind w:firstLine="709"/>
-        <w:jc w:val="both"/>
+        <w:pStyle w:val="Heading2"/>
       </w:pPr>
       <w:r>
-        <w:rPr>
-          <w:rFonts w:ascii="Times New Roman" w:hAnsi="Times New Roman"/>
-          <w:b/>
-          <w:i w:val="0"/>
-          <w:color w:val="000000"/>
-          <w:sz w:val="28"/>
-        </w:rPr>
         <w:t>Структура работы</w:t>
       </w:r>
     </w:p>
@@ -1543,35 +806,17 @@
     </w:p>
     <w:p>
       <w:pPr>
-        <w:spacing w:before="360" w:after="240" w:line="360" w:lineRule="auto"/>
-        <w:ind w:firstLine="0"/>
-        <w:jc w:val="center"/>
+        <w:pStyle w:val="Heading1"/>
       </w:pPr>
       <w:r>
-        <w:rPr>
-          <w:rFonts w:ascii="Times New Roman" w:hAnsi="Times New Roman"/>
-          <w:b/>
-          <w:i w:val="0"/>
-          <w:color w:val="000000"/>
-          <w:sz w:val="28"/>
-        </w:rPr>
         <w:t>ЧАСТЬ I. ТЕОРЕТИЧЕСКАЯ ЧАСТЬ</w:t>
       </w:r>
     </w:p>
     <w:p>
       <w:pPr>
-        <w:spacing w:before="240" w:after="120" w:line="360" w:lineRule="auto"/>
-        <w:ind w:firstLine="709"/>
-        <w:jc w:val="both"/>
+        <w:pStyle w:val="Heading2"/>
       </w:pPr>
       <w:r>
-        <w:rPr>
-          <w:rFonts w:ascii="Times New Roman" w:hAnsi="Times New Roman"/>
-          <w:b/>
-          <w:i w:val="0"/>
-          <w:color w:val="000000"/>
-          <w:sz w:val="28"/>
-        </w:rPr>
         <w:t>1.1. Машинное обучение: основные понятия и задачи</w:t>
       </w:r>
     </w:p>
@@ -1623,7 +868,7 @@
           <w:color w:val="000000"/>
           <w:sz w:val="28"/>
         </w:rPr>
-        <w:t>Центральная проблема обобщения в машинном обучении — «переобучение» (overfitting) и «недообучение» (underfitting). Переобучение возникает, когда модель запоминает обучающие данные, включая шум, теряя способность к обобщению. Недообучение — когда модель слишком проста. Для диагностики используют кривые обучения (learning curves), для борьбы — регуляризацию, dropout, ранняя остановка.</w:t>
+        <w:t>Центральная проблема обобщения в машинном обучении — «переобучение» (overfitting) и «недообучение» (underfitting). Переобучение возникает, когда модель запоминает обучающие данные, включая шум, теряя способность к обобщению. Недообучение — когда модель слишком проста. Для диагностики используют кривые обучения (learning curves), для борьбы — регуляризацию, dropout, раннюю остановку.</w:t>
       </w:r>
     </w:p>
     <w:p>
@@ -2067,18 +1312,9 @@
     <w:p/>
     <w:p>
       <w:pPr>
-        <w:spacing w:before="240" w:after="120" w:line="360" w:lineRule="auto"/>
-        <w:ind w:firstLine="709"/>
-        <w:jc w:val="both"/>
+        <w:pStyle w:val="Heading2"/>
       </w:pPr>
       <w:r>
-        <w:rPr>
-          <w:rFonts w:ascii="Times New Roman" w:hAnsi="Times New Roman"/>
-          <w:b/>
-          <w:i w:val="0"/>
-          <w:color w:val="000000"/>
-          <w:sz w:val="28"/>
-        </w:rPr>
         <w:t>1.2. Нейронные сети</w:t>
       </w:r>
     </w:p>
@@ -2758,18 +1994,9 @@
     </w:p>
     <w:p>
       <w:pPr>
-        <w:spacing w:before="160" w:after="80" w:line="360" w:lineRule="auto"/>
-        <w:ind w:firstLine="709"/>
-        <w:jc w:val="both"/>
+        <w:pStyle w:val="Heading3"/>
       </w:pPr>
       <w:r>
-        <w:rPr>
-          <w:rFonts w:ascii="Times New Roman" w:hAnsi="Times New Roman"/>
-          <w:b/>
-          <w:i w:val="0"/>
-          <w:color w:val="000000"/>
-          <w:sz w:val="28"/>
-        </w:rPr>
         <w:t>1.2.1. Многослойный персептрон (MLP)</w:t>
       </w:r>
     </w:p>
@@ -2809,18 +2036,9 @@
     </w:p>
     <w:p>
       <w:pPr>
-        <w:spacing w:before="160" w:after="80" w:line="360" w:lineRule="auto"/>
-        <w:ind w:firstLine="709"/>
-        <w:jc w:val="both"/>
+        <w:pStyle w:val="Heading3"/>
       </w:pPr>
       <w:r>
-        <w:rPr>
-          <w:rFonts w:ascii="Times New Roman" w:hAnsi="Times New Roman"/>
-          <w:b/>
-          <w:i w:val="0"/>
-          <w:color w:val="000000"/>
-          <w:sz w:val="28"/>
-        </w:rPr>
         <w:t>1.2.2. Глубокие нейронные сети и их ограничения для табличных данных</w:t>
       </w:r>
     </w:p>
@@ -2843,18 +2061,9 @@
     </w:p>
     <w:p>
       <w:pPr>
-        <w:spacing w:before="240" w:after="120" w:line="360" w:lineRule="auto"/>
-        <w:ind w:firstLine="709"/>
-        <w:jc w:val="both"/>
+        <w:pStyle w:val="Heading2"/>
       </w:pPr>
       <w:r>
-        <w:rPr>
-          <w:rFonts w:ascii="Times New Roman" w:hAnsi="Times New Roman"/>
-          <w:b/>
-          <w:i w:val="0"/>
-          <w:color w:val="000000"/>
-          <w:sz w:val="28"/>
-        </w:rPr>
         <w:t>1.3. Обучение с учителем и без учителя</w:t>
       </w:r>
     </w:p>
@@ -3320,18 +2529,9 @@
     </w:p>
     <w:p>
       <w:pPr>
-        <w:spacing w:before="240" w:after="120" w:line="360" w:lineRule="auto"/>
-        <w:ind w:firstLine="709"/>
-        <w:jc w:val="both"/>
+        <w:pStyle w:val="Heading2"/>
       </w:pPr>
       <w:r>
-        <w:rPr>
-          <w:rFonts w:ascii="Times New Roman" w:hAnsi="Times New Roman"/>
-          <w:b/>
-          <w:i w:val="0"/>
-          <w:color w:val="000000"/>
-          <w:sz w:val="28"/>
-        </w:rPr>
         <w:t>1.4. Деревья решений и ансамблевые методы</w:t>
       </w:r>
     </w:p>
@@ -4127,18 +3327,9 @@
     <w:p/>
     <w:p>
       <w:pPr>
-        <w:spacing w:before="240" w:after="120" w:line="360" w:lineRule="auto"/>
-        <w:ind w:firstLine="709"/>
-        <w:jc w:val="both"/>
+        <w:pStyle w:val="Heading2"/>
       </w:pPr>
       <w:r>
-        <w:rPr>
-          <w:rFonts w:ascii="Times New Roman" w:hAnsi="Times New Roman"/>
-          <w:b/>
-          <w:i w:val="0"/>
-          <w:color w:val="000000"/>
-          <w:sz w:val="28"/>
-        </w:rPr>
         <w:t>1.5. Градиентный бустинг</w:t>
       </w:r>
     </w:p>
@@ -4190,7 +3381,7 @@
           <w:color w:val="000000"/>
           <w:sz w:val="28"/>
         </w:rPr>
-        <w:t>Инициализация: F₀(x) = ȳ (среднее по обучающей выборке).</w:t>
+        <w:t>1) Инициализация: F₀(x) = ȳ (среднее по обучающей выборке).</w:t>
       </w:r>
     </w:p>
     <w:p>
@@ -4207,7 +3398,7 @@
           <w:color w:val="000000"/>
           <w:sz w:val="28"/>
         </w:rPr>
-        <w:t>Для m = 1, …, M:</w:t>
+        <w:t>2) Для m = 1, …, M:</w:t>
       </w:r>
     </w:p>
     <w:p>
@@ -4292,7 +3483,7 @@
           <w:color w:val="000000"/>
           <w:sz w:val="28"/>
         </w:rPr>
-        <w:t>Итог: F(x) = FM(x).</w:t>
+        <w:t>3) Итог: F(x) = FM(x).</w:t>
       </w:r>
     </w:p>
     <w:p>
@@ -4336,35 +3527,17 @@
     </w:p>
     <w:p>
       <w:pPr>
-        <w:spacing w:before="360" w:after="240" w:line="360" w:lineRule="auto"/>
-        <w:ind w:firstLine="0"/>
-        <w:jc w:val="center"/>
+        <w:pStyle w:val="Heading1"/>
       </w:pPr>
       <w:r>
-        <w:rPr>
-          <w:rFonts w:ascii="Times New Roman" w:hAnsi="Times New Roman"/>
-          <w:b/>
-          <w:i w:val="0"/>
-          <w:color w:val="000000"/>
-          <w:sz w:val="28"/>
-        </w:rPr>
         <w:t>ЧАСТЬ II. ПРАКТИЧЕСКАЯ ЧАСТЬ</w:t>
       </w:r>
     </w:p>
     <w:p>
       <w:pPr>
-        <w:spacing w:before="240" w:after="120" w:line="360" w:lineRule="auto"/>
-        <w:ind w:firstLine="709"/>
-        <w:jc w:val="both"/>
+        <w:pStyle w:val="Heading2"/>
       </w:pPr>
       <w:r>
-        <w:rPr>
-          <w:rFonts w:ascii="Times New Roman" w:hAnsi="Times New Roman"/>
-          <w:b/>
-          <w:i w:val="0"/>
-          <w:color w:val="000000"/>
-          <w:sz w:val="28"/>
-        </w:rPr>
         <w:t>2.1. Технологический стек</w:t>
       </w:r>
     </w:p>
@@ -5149,35 +4322,17 @@
     </w:p>
     <w:p>
       <w:pPr>
-        <w:spacing w:before="240" w:after="120" w:line="360" w:lineRule="auto"/>
-        <w:ind w:firstLine="709"/>
-        <w:jc w:val="both"/>
+        <w:pStyle w:val="Heading2"/>
       </w:pPr>
       <w:r>
-        <w:rPr>
-          <w:rFonts w:ascii="Times New Roman" w:hAnsi="Times New Roman"/>
-          <w:b/>
-          <w:i w:val="0"/>
-          <w:color w:val="000000"/>
-          <w:sz w:val="28"/>
-        </w:rPr>
         <w:t>2.2. Используемые библиотеки и модули</w:t>
       </w:r>
     </w:p>
     <w:p>
       <w:pPr>
-        <w:spacing w:before="160" w:after="80" w:line="360" w:lineRule="auto"/>
-        <w:ind w:firstLine="709"/>
-        <w:jc w:val="both"/>
+        <w:pStyle w:val="Heading3"/>
       </w:pPr>
       <w:r>
-        <w:rPr>
-          <w:rFonts w:ascii="Times New Roman" w:hAnsi="Times New Roman"/>
-          <w:b/>
-          <w:i w:val="0"/>
-          <w:color w:val="000000"/>
-          <w:sz w:val="28"/>
-        </w:rPr>
         <w:t>2.2.1. scikit-learn</w:t>
       </w:r>
     </w:p>
@@ -5319,18 +4474,9 @@
     </w:p>
     <w:p>
       <w:pPr>
-        <w:spacing w:before="160" w:after="80" w:line="360" w:lineRule="auto"/>
-        <w:ind w:firstLine="709"/>
-        <w:jc w:val="both"/>
+        <w:pStyle w:val="Heading3"/>
       </w:pPr>
       <w:r>
-        <w:rPr>
-          <w:rFonts w:ascii="Times New Roman" w:hAnsi="Times New Roman"/>
-          <w:b/>
-          <w:i w:val="0"/>
-          <w:color w:val="000000"/>
-          <w:sz w:val="28"/>
-        </w:rPr>
         <w:t>2.2.2. pandas и numpy</w:t>
       </w:r>
     </w:p>
@@ -5353,18 +4499,9 @@
     </w:p>
     <w:p>
       <w:pPr>
-        <w:spacing w:before="160" w:after="80" w:line="360" w:lineRule="auto"/>
-        <w:ind w:firstLine="709"/>
-        <w:jc w:val="both"/>
+        <w:pStyle w:val="Heading3"/>
       </w:pPr>
       <w:r>
-        <w:rPr>
-          <w:rFonts w:ascii="Times New Roman" w:hAnsi="Times New Roman"/>
-          <w:b/>
-          <w:i w:val="0"/>
-          <w:color w:val="000000"/>
-          <w:sz w:val="28"/>
-        </w:rPr>
         <w:t>2.2.3. Streamlit</w:t>
       </w:r>
     </w:p>
@@ -5387,18 +4524,9 @@
     </w:p>
     <w:p>
       <w:pPr>
-        <w:spacing w:before="240" w:after="120" w:line="360" w:lineRule="auto"/>
-        <w:ind w:firstLine="709"/>
-        <w:jc w:val="both"/>
+        <w:pStyle w:val="Heading2"/>
       </w:pPr>
       <w:r>
-        <w:rPr>
-          <w:rFonts w:ascii="Times New Roman" w:hAnsi="Times New Roman"/>
-          <w:b/>
-          <w:i w:val="0"/>
-          <w:color w:val="000000"/>
-          <w:sz w:val="28"/>
-        </w:rPr>
         <w:t>2.3. Описание набора данных</w:t>
       </w:r>
     </w:p>
@@ -6659,18 +5787,9 @@
     <w:p/>
     <w:p>
       <w:pPr>
-        <w:spacing w:before="240" w:after="120" w:line="360" w:lineRule="auto"/>
-        <w:ind w:firstLine="709"/>
-        <w:jc w:val="both"/>
+        <w:pStyle w:val="Heading2"/>
       </w:pPr>
       <w:r>
-        <w:rPr>
-          <w:rFonts w:ascii="Times New Roman" w:hAnsi="Times New Roman"/>
-          <w:b/>
-          <w:i w:val="0"/>
-          <w:color w:val="000000"/>
-          <w:sz w:val="28"/>
-        </w:rPr>
         <w:t>2.4. Разведочный анализ данных (EDA)</w:t>
       </w:r>
     </w:p>
@@ -6693,18 +5812,9 @@
     </w:p>
     <w:p>
       <w:pPr>
-        <w:spacing w:before="160" w:after="80" w:line="360" w:lineRule="auto"/>
-        <w:ind w:firstLine="709"/>
-        <w:jc w:val="both"/>
+        <w:pStyle w:val="Heading3"/>
       </w:pPr>
       <w:r>
-        <w:rPr>
-          <w:rFonts w:ascii="Times New Roman" w:hAnsi="Times New Roman"/>
-          <w:b/>
-          <w:i w:val="0"/>
-          <w:color w:val="000000"/>
-          <w:sz w:val="28"/>
-        </w:rPr>
         <w:t>2.4.1. Анализ распределения цен</w:t>
       </w:r>
     </w:p>
@@ -6744,18 +5854,9 @@
     </w:p>
     <w:p>
       <w:pPr>
-        <w:spacing w:before="160" w:after="80" w:line="360" w:lineRule="auto"/>
-        <w:ind w:firstLine="709"/>
-        <w:jc w:val="both"/>
+        <w:pStyle w:val="Heading3"/>
       </w:pPr>
       <w:r>
-        <w:rPr>
-          <w:rFonts w:ascii="Times New Roman" w:hAnsi="Times New Roman"/>
-          <w:b/>
-          <w:i w:val="0"/>
-          <w:color w:val="000000"/>
-          <w:sz w:val="28"/>
-        </w:rPr>
         <w:t>2.4.2. Анализ цен по районам</w:t>
       </w:r>
     </w:p>
@@ -6778,18 +5879,9 @@
     </w:p>
     <w:p>
       <w:pPr>
-        <w:spacing w:before="160" w:after="80" w:line="360" w:lineRule="auto"/>
-        <w:ind w:firstLine="709"/>
-        <w:jc w:val="both"/>
+        <w:pStyle w:val="Heading3"/>
       </w:pPr>
       <w:r>
-        <w:rPr>
-          <w:rFonts w:ascii="Times New Roman" w:hAnsi="Times New Roman"/>
-          <w:b/>
-          <w:i w:val="0"/>
-          <w:color w:val="000000"/>
-          <w:sz w:val="28"/>
-        </w:rPr>
         <w:t>2.4.3. Зависимость площади и цены</w:t>
       </w:r>
     </w:p>
@@ -6812,18 +5904,9 @@
     </w:p>
     <w:p>
       <w:pPr>
-        <w:spacing w:before="160" w:after="80" w:line="360" w:lineRule="auto"/>
-        <w:ind w:firstLine="709"/>
-        <w:jc w:val="both"/>
+        <w:pStyle w:val="Heading3"/>
       </w:pPr>
       <w:r>
-        <w:rPr>
-          <w:rFonts w:ascii="Times New Roman" w:hAnsi="Times New Roman"/>
-          <w:b/>
-          <w:i w:val="0"/>
-          <w:color w:val="000000"/>
-          <w:sz w:val="28"/>
-        </w:rPr>
         <w:t>2.4.4. Матрица корреляций</w:t>
       </w:r>
     </w:p>
@@ -6943,23 +6026,14 @@
           <w:color w:val="000000"/>
           <w:sz w:val="28"/>
         </w:rPr>
-        <w:t>Матрица корреляций также выявляет высокую корреляцию между площадью и числом комнат (r ≈ 0.80), что ожидаемо: чем больше комнат, тем больше площадь. Это мультиколлинеарность не является проблемой для деревьев и градиентного бустинга, однако критична для линейной регрессии.</w:t>
+        <w:t>Матрица корреляций также выявляет высокую корреляцию между площадью и числом комнат (r ≈ 0.80), что ожидаемо: чем больше комнат, тем больше площадь. Эта мультиколлинеарность не является проблемой для деревьев и градиентного бустинга, однако критична для линейной регрессии.</w:t>
       </w:r>
     </w:p>
     <w:p>
       <w:pPr>
-        <w:spacing w:before="240" w:after="120" w:line="360" w:lineRule="auto"/>
-        <w:ind w:firstLine="709"/>
-        <w:jc w:val="both"/>
+        <w:pStyle w:val="Heading2"/>
       </w:pPr>
       <w:r>
-        <w:rPr>
-          <w:rFonts w:ascii="Times New Roman" w:hAnsi="Times New Roman"/>
-          <w:b/>
-          <w:i w:val="0"/>
-          <w:color w:val="000000"/>
-          <w:sz w:val="28"/>
-        </w:rPr>
         <w:t>2.5. Предобработка данных и нормировка</w:t>
       </w:r>
     </w:p>
@@ -6982,18 +6056,9 @@
     </w:p>
     <w:p>
       <w:pPr>
-        <w:spacing w:before="160" w:after="80" w:line="360" w:lineRule="auto"/>
-        <w:ind w:firstLine="709"/>
-        <w:jc w:val="both"/>
+        <w:pStyle w:val="Heading3"/>
       </w:pPr>
       <w:r>
-        <w:rPr>
-          <w:rFonts w:ascii="Times New Roman" w:hAnsi="Times New Roman"/>
-          <w:b/>
-          <w:i w:val="0"/>
-          <w:color w:val="000000"/>
-          <w:sz w:val="28"/>
-        </w:rPr>
         <w:t>2.5.1. Разработка признаков (Feature Engineering)</w:t>
       </w:r>
     </w:p>
@@ -7067,18 +6132,9 @@
     </w:p>
     <w:p>
       <w:pPr>
-        <w:spacing w:before="160" w:after="80" w:line="360" w:lineRule="auto"/>
-        <w:ind w:firstLine="709"/>
-        <w:jc w:val="both"/>
+        <w:pStyle w:val="Heading3"/>
       </w:pPr>
       <w:r>
-        <w:rPr>
-          <w:rFonts w:ascii="Times New Roman" w:hAnsi="Times New Roman"/>
-          <w:b/>
-          <w:i w:val="0"/>
-          <w:color w:val="000000"/>
-          <w:sz w:val="28"/>
-        </w:rPr>
         <w:t>2.5.2. Стандартизация числовых признаков</w:t>
       </w:r>
     </w:p>
@@ -7101,18 +6157,9 @@
     </w:p>
     <w:p>
       <w:pPr>
-        <w:spacing w:before="160" w:after="80" w:line="360" w:lineRule="auto"/>
-        <w:ind w:firstLine="709"/>
-        <w:jc w:val="both"/>
+        <w:pStyle w:val="Heading3"/>
       </w:pPr>
       <w:r>
-        <w:rPr>
-          <w:rFonts w:ascii="Times New Roman" w:hAnsi="Times New Roman"/>
-          <w:b/>
-          <w:i w:val="0"/>
-          <w:color w:val="000000"/>
-          <w:sz w:val="28"/>
-        </w:rPr>
         <w:t>2.5.3. Кодирование категориальных признаков</w:t>
       </w:r>
     </w:p>
@@ -7152,18 +6199,9 @@
     </w:p>
     <w:p>
       <w:pPr>
-        <w:spacing w:before="240" w:after="120" w:line="360" w:lineRule="auto"/>
-        <w:ind w:firstLine="709"/>
-        <w:jc w:val="both"/>
+        <w:pStyle w:val="Heading2"/>
       </w:pPr>
       <w:r>
-        <w:rPr>
-          <w:rFonts w:ascii="Times New Roman" w:hAnsi="Times New Roman"/>
-          <w:b/>
-          <w:i w:val="0"/>
-          <w:color w:val="000000"/>
-          <w:sz w:val="28"/>
-        </w:rPr>
         <w:t>2.6. Архитектура модели</w:t>
       </w:r>
     </w:p>
@@ -7795,35 +6833,17 @@
     <w:p/>
     <w:p>
       <w:pPr>
-        <w:spacing w:before="240" w:after="120" w:line="360" w:lineRule="auto"/>
-        <w:ind w:firstLine="709"/>
-        <w:jc w:val="both"/>
+        <w:pStyle w:val="Heading2"/>
       </w:pPr>
       <w:r>
-        <w:rPr>
-          <w:rFonts w:ascii="Times New Roman" w:hAnsi="Times New Roman"/>
-          <w:b/>
-          <w:i w:val="0"/>
-          <w:color w:val="000000"/>
-          <w:sz w:val="28"/>
-        </w:rPr>
         <w:t>2.7. Обучение, кросс-валидация и оценка качества</w:t>
       </w:r>
     </w:p>
     <w:p>
       <w:pPr>
-        <w:spacing w:before="160" w:after="80" w:line="360" w:lineRule="auto"/>
-        <w:ind w:firstLine="709"/>
-        <w:jc w:val="both"/>
+        <w:pStyle w:val="Heading3"/>
       </w:pPr>
       <w:r>
-        <w:rPr>
-          <w:rFonts w:ascii="Times New Roman" w:hAnsi="Times New Roman"/>
-          <w:b/>
-          <w:i w:val="0"/>
-          <w:color w:val="000000"/>
-          <w:sz w:val="28"/>
-        </w:rPr>
         <w:t>2.7.1. Разбиение выборки</w:t>
       </w:r>
     </w:p>
@@ -7846,18 +6866,9 @@
     </w:p>
     <w:p>
       <w:pPr>
-        <w:spacing w:before="160" w:after="80" w:line="360" w:lineRule="auto"/>
-        <w:ind w:firstLine="709"/>
-        <w:jc w:val="both"/>
+        <w:pStyle w:val="Heading3"/>
       </w:pPr>
       <w:r>
-        <w:rPr>
-          <w:rFonts w:ascii="Times New Roman" w:hAnsi="Times New Roman"/>
-          <w:b/>
-          <w:i w:val="0"/>
-          <w:color w:val="000000"/>
-          <w:sz w:val="28"/>
-        </w:rPr>
         <w:t>2.7.2. K-кратная кросс-валидация</w:t>
       </w:r>
     </w:p>
@@ -8016,18 +7027,9 @@
     </w:p>
     <w:p>
       <w:pPr>
-        <w:spacing w:before="160" w:after="80" w:line="360" w:lineRule="auto"/>
-        <w:ind w:firstLine="709"/>
-        <w:jc w:val="both"/>
+        <w:pStyle w:val="Heading3"/>
       </w:pPr>
       <w:r>
-        <w:rPr>
-          <w:rFonts w:ascii="Times New Roman" w:hAnsi="Times New Roman"/>
-          <w:b/>
-          <w:i w:val="0"/>
-          <w:color w:val="000000"/>
-          <w:sz w:val="28"/>
-        </w:rPr>
         <w:t>2.7.3. Подбор гиперпараметров</w:t>
       </w:r>
     </w:p>
@@ -8135,18 +7137,9 @@
     </w:p>
     <w:p>
       <w:pPr>
-        <w:spacing w:before="160" w:after="80" w:line="360" w:lineRule="auto"/>
-        <w:ind w:firstLine="709"/>
-        <w:jc w:val="both"/>
+        <w:pStyle w:val="Heading3"/>
       </w:pPr>
       <w:r>
-        <w:rPr>
-          <w:rFonts w:ascii="Times New Roman" w:hAnsi="Times New Roman"/>
-          <w:b/>
-          <w:i w:val="0"/>
-          <w:color w:val="000000"/>
-          <w:sz w:val="28"/>
-        </w:rPr>
         <w:t>2.7.4. Метрики качества на тестовой выборке</w:t>
       </w:r>
     </w:p>
@@ -8625,18 +7618,9 @@
     </w:p>
     <w:p>
       <w:pPr>
-        <w:spacing w:before="240" w:after="120" w:line="360" w:lineRule="auto"/>
-        <w:ind w:firstLine="709"/>
-        <w:jc w:val="both"/>
+        <w:pStyle w:val="Heading2"/>
       </w:pPr>
       <w:r>
-        <w:rPr>
-          <w:rFonts w:ascii="Times New Roman" w:hAnsi="Times New Roman"/>
-          <w:b/>
-          <w:i w:val="0"/>
-          <w:color w:val="000000"/>
-          <w:sz w:val="28"/>
-        </w:rPr>
         <w:t>2.8. Веб-приложение (Streamlit)</w:t>
       </w:r>
     </w:p>
@@ -8902,35 +7886,17 @@
     </w:p>
     <w:p>
       <w:pPr>
-        <w:spacing w:before="360" w:after="240" w:line="360" w:lineRule="auto"/>
-        <w:ind w:firstLine="0"/>
-        <w:jc w:val="center"/>
+        <w:pStyle w:val="Heading1"/>
       </w:pPr>
       <w:r>
-        <w:rPr>
-          <w:rFonts w:ascii="Times New Roman" w:hAnsi="Times New Roman"/>
-          <w:b/>
-          <w:i w:val="0"/>
-          <w:color w:val="000000"/>
-          <w:sz w:val="28"/>
-        </w:rPr>
         <w:t>ЧАСТЬ III. ДОКУМЕНТАЦИОННАЯ ЧАСТЬ</w:t>
       </w:r>
     </w:p>
     <w:p>
       <w:pPr>
-        <w:spacing w:before="240" w:after="120" w:line="360" w:lineRule="auto"/>
-        <w:ind w:firstLine="709"/>
-        <w:jc w:val="both"/>
+        <w:pStyle w:val="Heading2"/>
       </w:pPr>
       <w:r>
-        <w:rPr>
-          <w:rFonts w:ascii="Times New Roman" w:hAnsi="Times New Roman"/>
-          <w:b/>
-          <w:i w:val="0"/>
-          <w:color w:val="000000"/>
-          <w:sz w:val="28"/>
-        </w:rPr>
         <w:t>3.1. Сравнение форматов сохранения модели: joblib и ONNX</w:t>
       </w:r>
     </w:p>
@@ -8953,18 +7919,9 @@
     </w:p>
     <w:p>
       <w:pPr>
-        <w:spacing w:before="160" w:after="80" w:line="360" w:lineRule="auto"/>
-        <w:ind w:firstLine="709"/>
-        <w:jc w:val="both"/>
+        <w:pStyle w:val="Heading3"/>
       </w:pPr>
       <w:r>
-        <w:rPr>
-          <w:rFonts w:ascii="Times New Roman" w:hAnsi="Times New Roman"/>
-          <w:b/>
-          <w:i w:val="0"/>
-          <w:color w:val="000000"/>
-          <w:sz w:val="28"/>
-        </w:rPr>
         <w:t>3.1.1. Формат joblib</w:t>
       </w:r>
     </w:p>
@@ -9123,18 +8080,9 @@
     </w:p>
     <w:p>
       <w:pPr>
-        <w:spacing w:before="160" w:after="80" w:line="360" w:lineRule="auto"/>
-        <w:ind w:firstLine="709"/>
-        <w:jc w:val="both"/>
+        <w:pStyle w:val="Heading3"/>
       </w:pPr>
       <w:r>
-        <w:rPr>
-          <w:rFonts w:ascii="Times New Roman" w:hAnsi="Times New Roman"/>
-          <w:b/>
-          <w:i w:val="0"/>
-          <w:color w:val="000000"/>
-          <w:sz w:val="28"/>
-        </w:rPr>
         <w:t>3.1.2. Формат ONNX</w:t>
       </w:r>
     </w:p>
@@ -9531,18 +8479,9 @@
     </w:p>
     <w:p>
       <w:pPr>
-        <w:spacing w:before="160" w:after="80" w:line="360" w:lineRule="auto"/>
-        <w:ind w:firstLine="709"/>
-        <w:jc w:val="both"/>
+        <w:pStyle w:val="Heading3"/>
       </w:pPr>
       <w:r>
-        <w:rPr>
-          <w:rFonts w:ascii="Times New Roman" w:hAnsi="Times New Roman"/>
-          <w:b/>
-          <w:i w:val="0"/>
-          <w:color w:val="000000"/>
-          <w:sz w:val="28"/>
-        </w:rPr>
         <w:t>3.1.3. Сравнительный анализ</w:t>
       </w:r>
     </w:p>
@@ -10276,35 +9215,17 @@
     </w:p>
     <w:p>
       <w:pPr>
-        <w:spacing w:before="240" w:after="120" w:line="360" w:lineRule="auto"/>
-        <w:ind w:firstLine="709"/>
-        <w:jc w:val="both"/>
+        <w:pStyle w:val="Heading2"/>
       </w:pPr>
       <w:r>
-        <w:rPr>
-          <w:rFonts w:ascii="Times New Roman" w:hAnsi="Times New Roman"/>
-          <w:b/>
-          <w:i w:val="0"/>
-          <w:color w:val="000000"/>
-          <w:sz w:val="28"/>
-        </w:rPr>
         <w:t>3.2. Руководство пользователя</w:t>
       </w:r>
     </w:p>
     <w:p>
       <w:pPr>
-        <w:spacing w:before="160" w:after="80" w:line="360" w:lineRule="auto"/>
-        <w:ind w:firstLine="709"/>
-        <w:jc w:val="both"/>
+        <w:pStyle w:val="Heading3"/>
       </w:pPr>
       <w:r>
-        <w:rPr>
-          <w:rFonts w:ascii="Times New Roman" w:hAnsi="Times New Roman"/>
-          <w:b/>
-          <w:i w:val="0"/>
-          <w:color w:val="000000"/>
-          <w:sz w:val="28"/>
-        </w:rPr>
         <w:t>3.2.1. Системные требования</w:t>
       </w:r>
     </w:p>
@@ -10662,18 +9583,9 @@
     <w:p/>
     <w:p>
       <w:pPr>
-        <w:spacing w:before="160" w:after="80" w:line="360" w:lineRule="auto"/>
-        <w:ind w:firstLine="709"/>
-        <w:jc w:val="both"/>
+        <w:pStyle w:val="Heading3"/>
       </w:pPr>
       <w:r>
-        <w:rPr>
-          <w:rFonts w:ascii="Times New Roman" w:hAnsi="Times New Roman"/>
-          <w:b/>
-          <w:i w:val="0"/>
-          <w:color w:val="000000"/>
-          <w:sz w:val="28"/>
-        </w:rPr>
         <w:t>3.2.2. Установка и запуск</w:t>
       </w:r>
     </w:p>
@@ -10900,18 +9812,9 @@
     </w:p>
     <w:p>
       <w:pPr>
-        <w:spacing w:before="160" w:after="80" w:line="360" w:lineRule="auto"/>
-        <w:ind w:firstLine="709"/>
-        <w:jc w:val="both"/>
+        <w:pStyle w:val="Heading3"/>
       </w:pPr>
       <w:r>
-        <w:rPr>
-          <w:rFonts w:ascii="Times New Roman" w:hAnsi="Times New Roman"/>
-          <w:b/>
-          <w:i w:val="0"/>
-          <w:color w:val="000000"/>
-          <w:sz w:val="28"/>
-        </w:rPr>
         <w:t>3.2.3. Работа с интерфейсом</w:t>
       </w:r>
     </w:p>
@@ -11019,18 +9922,9 @@
     </w:p>
     <w:p>
       <w:pPr>
-        <w:spacing w:before="160" w:after="80" w:line="360" w:lineRule="auto"/>
-        <w:ind w:firstLine="709"/>
-        <w:jc w:val="both"/>
+        <w:pStyle w:val="Heading3"/>
       </w:pPr>
       <w:r>
-        <w:rPr>
-          <w:rFonts w:ascii="Times New Roman" w:hAnsi="Times New Roman"/>
-          <w:b/>
-          <w:i w:val="0"/>
-          <w:color w:val="000000"/>
-          <w:sz w:val="28"/>
-        </w:rPr>
         <w:t>3.2.4. Часто задаваемые вопросы</w:t>
       </w:r>
     </w:p>
@@ -11291,18 +10185,9 @@
     </w:p>
     <w:p>
       <w:pPr>
-        <w:spacing w:before="360" w:after="240" w:line="360" w:lineRule="auto"/>
-        <w:ind w:firstLine="0"/>
-        <w:jc w:val="center"/>
+        <w:pStyle w:val="Heading1"/>
       </w:pPr>
       <w:r>
-        <w:rPr>
-          <w:rFonts w:ascii="Times New Roman" w:hAnsi="Times New Roman"/>
-          <w:b/>
-          <w:i w:val="0"/>
-          <w:color w:val="000000"/>
-          <w:sz w:val="28"/>
-        </w:rPr>
         <w:t>ЗАКЛЮЧЕНИЕ</w:t>
       </w:r>
     </w:p>
@@ -11619,18 +10504,9 @@
     </w:p>
     <w:p>
       <w:pPr>
-        <w:spacing w:before="360" w:after="240" w:line="360" w:lineRule="auto"/>
-        <w:ind w:firstLine="0"/>
-        <w:jc w:val="center"/>
+        <w:pStyle w:val="Heading1"/>
       </w:pPr>
       <w:r>
-        <w:rPr>
-          <w:rFonts w:ascii="Times New Roman" w:hAnsi="Times New Roman"/>
-          <w:b/>
-          <w:i w:val="0"/>
-          <w:color w:val="000000"/>
-          <w:sz w:val="28"/>
-        </w:rPr>
         <w:t>СПИСОК ИСПОЛЬЗОВАННЫХ ИСТОЧНИКОВ</w:t>
       </w:r>
     </w:p>
@@ -12312,16 +11188,20 @@
     <w:pPr>
       <w:keepNext/>
       <w:keepLines/>
-      <w:spacing w:before="480" w:after="0"/>
+      <w:spacing w:before="360" w:after="240" w:line="360" w:lineRule="auto"/>
+      <w:ind w:firstLine="0" w:left="0"/>
+      <w:jc w:val="center"/>
       <w:outlineLvl w:val="0"/>
     </w:pPr>
     <w:rPr>
-      <w:rFonts w:asciiTheme="majorHAnsi" w:eastAsiaTheme="majorEastAsia" w:hAnsiTheme="majorHAnsi" w:cstheme="majorBidi"/>
+      <w:rFonts w:asciiTheme="majorHAnsi" w:eastAsiaTheme="majorEastAsia" w:hAnsiTheme="majorHAnsi" w:cstheme="majorBidi" w:ascii="Times New Roman" w:hAnsi="Times New Roman"/>
       <w:b/>
       <w:bCs/>
-      <w:color w:val="365F91" w:themeColor="accent1" w:themeShade="BF"/>
+      <w:i w:val="0"/>
+      <w:color w:val="000000"/>
       <w:sz w:val="28"/>
       <w:szCs w:val="28"/>
+      <w:color w:val="000000"/>
     </w:rPr>
   </w:style>
   <w:style w:type="paragraph" w:styleId="Heading2">
@@ -12336,16 +11216,20 @@
     <w:pPr>
       <w:keepNext/>
       <w:keepLines/>
-      <w:spacing w:before="200" w:after="0"/>
+      <w:spacing w:before="240" w:after="120" w:line="360" w:lineRule="auto"/>
+      <w:ind w:firstLine="709" w:left="0"/>
+      <w:jc w:val="both"/>
       <w:outlineLvl w:val="1"/>
     </w:pPr>
     <w:rPr>
-      <w:rFonts w:asciiTheme="majorHAnsi" w:eastAsiaTheme="majorEastAsia" w:hAnsiTheme="majorHAnsi" w:cstheme="majorBidi"/>
+      <w:rFonts w:asciiTheme="majorHAnsi" w:eastAsiaTheme="majorEastAsia" w:hAnsiTheme="majorHAnsi" w:cstheme="majorBidi" w:ascii="Times New Roman" w:hAnsi="Times New Roman"/>
       <w:b/>
       <w:bCs/>
-      <w:color w:val="4F81BD" w:themeColor="accent1"/>
-      <w:sz w:val="26"/>
+      <w:i w:val="0"/>
+      <w:color w:val="000000"/>
+      <w:sz w:val="28"/>
       <w:szCs w:val="26"/>
+      <w:color w:val="000000"/>
     </w:rPr>
   </w:style>
   <w:style w:type="paragraph" w:styleId="Heading3">
@@ -12360,14 +11244,19 @@
     <w:pPr>
       <w:keepNext/>
       <w:keepLines/>
-      <w:spacing w:before="200" w:after="0"/>
+      <w:spacing w:before="160" w:after="80" w:line="360" w:lineRule="auto"/>
+      <w:ind w:firstLine="709" w:left="0"/>
+      <w:jc w:val="both"/>
       <w:outlineLvl w:val="2"/>
     </w:pPr>
     <w:rPr>
-      <w:rFonts w:asciiTheme="majorHAnsi" w:eastAsiaTheme="majorEastAsia" w:hAnsiTheme="majorHAnsi" w:cstheme="majorBidi"/>
+      <w:rFonts w:asciiTheme="majorHAnsi" w:eastAsiaTheme="majorEastAsia" w:hAnsiTheme="majorHAnsi" w:cstheme="majorBidi" w:ascii="Times New Roman" w:hAnsi="Times New Roman"/>
       <w:b/>
       <w:bCs/>
-      <w:color w:val="4F81BD" w:themeColor="accent1"/>
+      <w:i w:val="0"/>
+      <w:color w:val="000000"/>
+      <w:sz w:val="28"/>
+      <w:color w:val="000000"/>
     </w:rPr>
   </w:style>
   <w:style w:type="paragraph" w:styleId="Heading4">

</xml_diff>